<commit_message>
feat: Documento dos requisitos funcionais
</commit_message>
<xml_diff>
--- a/ApêndiceB-Requisitos/PID_RequisitosFuncionais.docx
+++ b/ApêndiceB-Requisitos/PID_RequisitosFuncionais.docx
@@ -7,12 +7,12 @@
         <w:tblW w:w="9640" w:type="dxa"/>
         <w:tblInd w:w="-431" w:type="dxa"/>
         <w:tblBorders>
-          <w:top w:val="single" w:sz="4" w:space="0" w:color="000000"/>
-          <w:left w:val="single" w:sz="4" w:space="0" w:color="000000"/>
-          <w:bottom w:val="single" w:sz="4" w:space="0" w:color="000000"/>
-          <w:right w:val="single" w:sz="4" w:space="0" w:color="000000"/>
-          <w:insideH w:val="single" w:sz="4" w:space="0" w:color="000000"/>
-          <w:insideV w:val="single" w:sz="4" w:space="0" w:color="000000"/>
+          <w:top w:val="single" w:color="000000" w:sz="4" w:space="0"/>
+          <w:left w:val="single" w:color="000000" w:sz="4" w:space="0"/>
+          <w:bottom w:val="single" w:color="000000" w:sz="4" w:space="0"/>
+          <w:right w:val="single" w:color="000000" w:sz="4" w:space="0"/>
+          <w:insideH w:val="single" w:color="000000" w:sz="4" w:space="0"/>
+          <w:insideV w:val="single" w:color="000000" w:sz="4" w:space="0"/>
         </w:tblBorders>
         <w:tblLayout w:type="fixed"/>
         <w:tblLook w:val="0400" w:firstRow="0" w:lastRow="0" w:firstColumn="0" w:lastColumn="0" w:noHBand="0" w:noVBand="1"/>
@@ -23,7 +23,7 @@
         <w:gridCol w:w="1843"/>
         <w:gridCol w:w="1701"/>
       </w:tblGrid>
-      <w:tr>
+      <w:tr xmlns:wp14="http://schemas.microsoft.com/office/word/2010/wordml" wp14:textId="77777777">
         <w:trPr>
           <w:trHeight w:val="336"/>
         </w:trPr>
@@ -32,9 +32,10 @@
             <w:tcW w:w="6096" w:type="dxa"/>
             <w:gridSpan w:val="2"/>
             <w:shd w:val="clear" w:color="auto" w:fill="DBE5F1"/>
+            <w:tcMar/>
             <w:vAlign w:val="center"/>
           </w:tcPr>
-          <w:p>
+          <w:p wp14:textId="77777777">
             <w:pPr>
               <w:pStyle w:val="Ttulo1"/>
               <w:jc w:val="center"/>
@@ -69,20 +70,21 @@
           <w:tcPr>
             <w:tcW w:w="1843" w:type="dxa"/>
             <w:shd w:val="clear" w:color="auto" w:fill="DBE5F1"/>
+            <w:tcMar/>
             <w:vAlign w:val="center"/>
           </w:tcPr>
-          <w:p>
+          <w:p wp14:textId="77777777">
             <w:pPr>
               <w:spacing w:after="0" w:line="240" w:lineRule="auto"/>
               <w:rPr>
-                <w:rFonts w:ascii="Times New Roman" w:eastAsia="Arial" w:hAnsi="Times New Roman" w:cs="Times New Roman"/>
+                <w:rFonts w:ascii="Times New Roman" w:hAnsi="Times New Roman" w:eastAsia="Arial" w:cs="Times New Roman"/>
                 <w:sz w:val="24"/>
                 <w:szCs w:val="24"/>
               </w:rPr>
             </w:pPr>
             <w:r>
               <w:rPr>
-                <w:rFonts w:ascii="Times New Roman" w:eastAsia="Arial" w:hAnsi="Times New Roman" w:cs="Times New Roman"/>
+                <w:rFonts w:ascii="Times New Roman" w:hAnsi="Times New Roman" w:eastAsia="Arial" w:cs="Times New Roman"/>
                 <w:sz w:val="24"/>
                 <w:szCs w:val="24"/>
               </w:rPr>
@@ -90,7 +92,7 @@
             </w:r>
             <w:r>
               <w:rPr>
-                <w:rFonts w:ascii="Times New Roman" w:eastAsia="Arial" w:hAnsi="Times New Roman" w:cs="Times New Roman"/>
+                <w:rFonts w:ascii="Times New Roman" w:hAnsi="Times New Roman" w:eastAsia="Arial" w:cs="Times New Roman"/>
                 <w:sz w:val="24"/>
                 <w:szCs w:val="24"/>
               </w:rPr>
@@ -102,38 +104,48 @@
           <w:tcPr>
             <w:tcW w:w="1701" w:type="dxa"/>
             <w:shd w:val="clear" w:color="auto" w:fill="DBE5F1"/>
+            <w:tcMar/>
             <w:vAlign w:val="center"/>
           </w:tcPr>
-          <w:p>
+          <w:p wp14:textId="366B1209">
             <w:pPr>
               <w:spacing w:after="0" w:line="240" w:lineRule="auto"/>
               <w:rPr>
-                <w:rFonts w:ascii="Times New Roman" w:eastAsia="Arial" w:hAnsi="Times New Roman" w:cs="Times New Roman"/>
-                <w:sz w:val="24"/>
-                <w:szCs w:val="24"/>
-              </w:rPr>
-            </w:pPr>
-          </w:p>
-        </w:tc>
-      </w:tr>
-      <w:tr>
-        <w:tc>
-          <w:tcPr>
-            <w:tcW w:w="2637" w:type="dxa"/>
-            <w:vAlign w:val="center"/>
-          </w:tcPr>
-          <w:p>
-            <w:pPr>
-              <w:spacing w:after="0" w:line="240" w:lineRule="auto"/>
-              <w:rPr>
-                <w:rFonts w:ascii="Times New Roman" w:eastAsia="Arial" w:hAnsi="Times New Roman" w:cs="Times New Roman"/>
+                <w:rFonts w:ascii="Times New Roman" w:hAnsi="Times New Roman" w:eastAsia="Arial" w:cs="Times New Roman"/>
                 <w:sz w:val="24"/>
                 <w:szCs w:val="24"/>
               </w:rPr>
             </w:pPr>
             <w:r>
               <w:rPr>
-                <w:rFonts w:ascii="Times New Roman" w:eastAsia="Arial" w:hAnsi="Times New Roman" w:cs="Times New Roman"/>
+                <w:rFonts w:ascii="Times New Roman" w:hAnsi="Times New Roman" w:eastAsia="Arial" w:cs="Times New Roman"/>
+                <w:sz w:val="24"/>
+                <w:szCs w:val="24"/>
+              </w:rPr>
+              <w:t>20/03</w:t>
+            </w:r>
+          </w:p>
+        </w:tc>
+      </w:tr>
+      <w:tr xmlns:wp14="http://schemas.microsoft.com/office/word/2010/wordml" wp14:textId="77777777">
+        <w:tc>
+          <w:tcPr>
+            <w:tcW w:w="2637" w:type="dxa"/>
+            <w:tcMar/>
+            <w:vAlign w:val="center"/>
+          </w:tcPr>
+          <w:p wp14:textId="77777777">
+            <w:pPr>
+              <w:spacing w:after="0" w:line="240" w:lineRule="auto"/>
+              <w:rPr>
+                <w:rFonts w:ascii="Times New Roman" w:hAnsi="Times New Roman" w:eastAsia="Arial" w:cs="Times New Roman"/>
+                <w:sz w:val="24"/>
+                <w:szCs w:val="24"/>
+              </w:rPr>
+            </w:pPr>
+            <w:r>
+              <w:rPr>
+                <w:rFonts w:ascii="Times New Roman" w:hAnsi="Times New Roman" w:eastAsia="Arial" w:cs="Times New Roman"/>
                 <w:sz w:val="24"/>
                 <w:szCs w:val="24"/>
               </w:rPr>
@@ -145,41 +157,51 @@
           <w:tcPr>
             <w:tcW w:w="7003" w:type="dxa"/>
             <w:gridSpan w:val="3"/>
+            <w:tcMar/>
             <w:vAlign w:val="center"/>
           </w:tcPr>
-          <w:p>
+          <w:p wp14:textId="2D43BC62">
             <w:pPr>
               <w:spacing w:after="0" w:line="240" w:lineRule="auto"/>
               <w:rPr>
-                <w:rFonts w:ascii="Times New Roman" w:eastAsia="Arial" w:hAnsi="Times New Roman" w:cs="Times New Roman"/>
-                <w:sz w:val="24"/>
-                <w:szCs w:val="24"/>
-              </w:rPr>
-            </w:pPr>
-          </w:p>
-        </w:tc>
-      </w:tr>
-      <w:tr>
-        <w:tc>
-          <w:tcPr>
-            <w:tcW w:w="2637" w:type="dxa"/>
-            <w:tcBorders>
-              <w:bottom w:val="single" w:sz="4" w:space="0" w:color="000000"/>
-            </w:tcBorders>
-            <w:vAlign w:val="center"/>
-          </w:tcPr>
-          <w:p>
-            <w:pPr>
-              <w:spacing w:after="0" w:line="240" w:lineRule="auto"/>
-              <w:rPr>
-                <w:rFonts w:ascii="Times New Roman" w:eastAsia="Arial" w:hAnsi="Times New Roman" w:cs="Times New Roman"/>
+                <w:rFonts w:ascii="Times New Roman" w:hAnsi="Times New Roman" w:eastAsia="Arial" w:cs="Times New Roman"/>
                 <w:sz w:val="24"/>
                 <w:szCs w:val="24"/>
               </w:rPr>
             </w:pPr>
             <w:r>
               <w:rPr>
-                <w:rFonts w:ascii="Times New Roman" w:eastAsia="Arial" w:hAnsi="Times New Roman" w:cs="Times New Roman"/>
+                <w:rFonts w:ascii="Times New Roman" w:hAnsi="Times New Roman" w:eastAsia="Arial" w:cs="Times New Roman"/>
+                <w:sz w:val="24"/>
+                <w:szCs w:val="24"/>
+              </w:rPr>
+              <w:t>PetLink</w:t>
+            </w:r>
+          </w:p>
+        </w:tc>
+      </w:tr>
+      <w:tr xmlns:wp14="http://schemas.microsoft.com/office/word/2010/wordml" wp14:textId="77777777">
+        <w:tc>
+          <w:tcPr>
+            <w:tcW w:w="2637" w:type="dxa"/>
+            <w:tcBorders>
+              <w:bottom w:val="single" w:color="000000" w:themeColor="text1" w:sz="4" w:space="0"/>
+            </w:tcBorders>
+            <w:tcMar/>
+            <w:vAlign w:val="center"/>
+          </w:tcPr>
+          <w:p wp14:textId="77777777">
+            <w:pPr>
+              <w:spacing w:after="0" w:line="240" w:lineRule="auto"/>
+              <w:rPr>
+                <w:rFonts w:ascii="Times New Roman" w:hAnsi="Times New Roman" w:eastAsia="Arial" w:cs="Times New Roman"/>
+                <w:sz w:val="24"/>
+                <w:szCs w:val="24"/>
+              </w:rPr>
+            </w:pPr>
+            <w:r>
+              <w:rPr>
+                <w:rFonts w:ascii="Times New Roman" w:hAnsi="Times New Roman" w:eastAsia="Arial" w:cs="Times New Roman"/>
                 <w:sz w:val="24"/>
                 <w:szCs w:val="24"/>
               </w:rPr>
@@ -187,13 +209,13 @@
             </w:r>
             <w:r>
               <w:rPr>
-                <w:rFonts w:ascii="Times New Roman" w:eastAsia="Arial" w:hAnsi="Times New Roman" w:cs="Times New Roman"/>
+                <w:rFonts w:ascii="Times New Roman" w:hAnsi="Times New Roman" w:eastAsia="Arial" w:cs="Times New Roman"/>
                 <w:sz w:val="24"/>
                 <w:szCs w:val="24"/>
               </w:rPr>
               <w:t>:</w:t>
             </w:r>
-            <w:bookmarkStart w:id="0" w:name="_GoBack"/>
+            <w:bookmarkStart w:name="_GoBack" w:id="0"/>
             <w:bookmarkEnd w:id="0"/>
           </w:p>
         </w:tc>
@@ -202,23 +224,32 @@
             <w:tcW w:w="7003" w:type="dxa"/>
             <w:gridSpan w:val="3"/>
             <w:tcBorders>
-              <w:bottom w:val="single" w:sz="4" w:space="0" w:color="000000"/>
+              <w:bottom w:val="single" w:color="000000" w:themeColor="text1" w:sz="4" w:space="0"/>
             </w:tcBorders>
+            <w:tcMar/>
             <w:vAlign w:val="center"/>
           </w:tcPr>
-          <w:p>
+          <w:p wp14:textId="66685320">
             <w:pPr>
               <w:spacing w:after="0" w:line="240" w:lineRule="auto"/>
               <w:rPr>
-                <w:rFonts w:ascii="Times New Roman" w:eastAsia="Arial" w:hAnsi="Times New Roman" w:cs="Times New Roman"/>
+                <w:rFonts w:ascii="Times New Roman" w:hAnsi="Times New Roman" w:eastAsia="Arial" w:cs="Times New Roman"/>
                 <w:sz w:val="24"/>
                 <w:szCs w:val="24"/>
               </w:rPr>
             </w:pPr>
+            <w:r>
+              <w:rPr>
+                <w:rFonts w:ascii="Times New Roman" w:hAnsi="Times New Roman" w:eastAsia="Arial" w:cs="Times New Roman"/>
+                <w:sz w:val="24"/>
+                <w:szCs w:val="24"/>
+              </w:rPr>
+              <w:t>Danilo</w:t>
+            </w:r>
           </w:p>
         </w:tc>
       </w:tr>
-      <w:tr>
+      <w:tr xmlns:wp14="http://schemas.microsoft.com/office/word/2010/wordml" wp14:textId="77777777">
         <w:trPr>
           <w:trHeight w:val="153"/>
         </w:trPr>
@@ -227,13 +258,14 @@
             <w:tcW w:w="9640" w:type="dxa"/>
             <w:gridSpan w:val="4"/>
             <w:shd w:val="clear" w:color="auto" w:fill="DBE5F1"/>
+            <w:tcMar/>
             <w:vAlign w:val="center"/>
           </w:tcPr>
-          <w:p>
+          <w:p wp14:textId="77777777">
             <w:pPr>
               <w:spacing w:after="0" w:line="240" w:lineRule="auto"/>
               <w:rPr>
-                <w:rFonts w:ascii="Times New Roman" w:eastAsia="Arial" w:hAnsi="Times New Roman" w:cs="Times New Roman"/>
+                <w:rFonts w:ascii="Times New Roman" w:hAnsi="Times New Roman" w:eastAsia="Arial" w:cs="Times New Roman"/>
                 <w:sz w:val="24"/>
                 <w:szCs w:val="24"/>
               </w:rPr>
@@ -242,16 +274,16 @@
         </w:tc>
       </w:tr>
     </w:tbl>
-    <w:p>
-      <w:pPr>
-        <w:rPr>
-          <w:rFonts w:ascii="Times New Roman" w:hAnsi="Times New Roman" w:cs="Times New Roman"/>
-          <w:sz w:val="24"/>
-          <w:szCs w:val="24"/>
-        </w:rPr>
-      </w:pPr>
-    </w:p>
-    <w:p>
+    <w:p xmlns:wp14="http://schemas.microsoft.com/office/word/2010/wordml" wp14:textId="77777777">
+      <w:pPr>
+        <w:rPr>
+          <w:rFonts w:ascii="Times New Roman" w:hAnsi="Times New Roman" w:cs="Times New Roman"/>
+          <w:sz w:val="24"/>
+          <w:szCs w:val="24"/>
+        </w:rPr>
+      </w:pPr>
+    </w:p>
+    <w:p xmlns:wp14="http://schemas.microsoft.com/office/word/2010/wordml" wp14:textId="7103A124">
       <w:pPr>
         <w:rPr>
           <w:rFonts w:ascii="Times New Roman" w:hAnsi="Times New Roman" w:cs="Times New Roman"/>
@@ -289,10 +321,18 @@
           <w:sz w:val="24"/>
           <w:szCs w:val="24"/>
         </w:rPr>
-        <w:t>Título do requisito (nomear com verbo)</w:t>
-      </w:r>
-    </w:p>
-    <w:p>
+        <w:t>Login</w:t>
+      </w:r>
+      <w:r>
+        <w:rPr>
+          <w:rFonts w:ascii="Times New Roman" w:hAnsi="Times New Roman" w:cs="Times New Roman"/>
+          <w:sz w:val="24"/>
+          <w:szCs w:val="24"/>
+        </w:rPr>
+        <w:t xml:space="preserve"> de usuario</w:t>
+      </w:r>
+    </w:p>
+    <w:p xmlns:wp14="http://schemas.microsoft.com/office/word/2010/wordml" wp14:textId="194DAF60">
       <w:pPr>
         <w:rPr>
           <w:rFonts w:ascii="Times New Roman" w:hAnsi="Times New Roman" w:cs="Times New Roman"/>
@@ -308,24 +348,55 @@
         </w:rPr>
         <w:t>Descrição:</w:t>
       </w:r>
-    </w:p>
-    <w:p>
-      <w:pPr>
-        <w:rPr>
-          <w:rFonts w:ascii="Times New Roman" w:hAnsi="Times New Roman" w:cs="Times New Roman"/>
-          <w:sz w:val="24"/>
-          <w:szCs w:val="24"/>
-        </w:rPr>
-      </w:pPr>
-    </w:p>
-    <w:p>
-      <w:pPr>
-        <w:rPr>
-          <w:rFonts w:ascii="Times New Roman" w:hAnsi="Times New Roman" w:cs="Times New Roman"/>
-          <w:sz w:val="24"/>
-          <w:szCs w:val="24"/>
-        </w:rPr>
-      </w:pPr>
+      <w:r>
+        <w:rPr>
+          <w:rFonts w:ascii="Times New Roman" w:hAnsi="Times New Roman" w:cs="Times New Roman"/>
+          <w:sz w:val="24"/>
+          <w:szCs w:val="24"/>
+        </w:rPr>
+        <w:t xml:space="preserve"> Uma tela na qual o </w:t>
+      </w:r>
+      <w:r>
+        <w:rPr>
+          <w:rFonts w:ascii="Times New Roman" w:hAnsi="Times New Roman" w:cs="Times New Roman"/>
+          <w:sz w:val="24"/>
+          <w:szCs w:val="24"/>
+        </w:rPr>
+        <w:t>usuário</w:t>
+      </w:r>
+      <w:r>
+        <w:rPr>
+          <w:rFonts w:ascii="Times New Roman" w:hAnsi="Times New Roman" w:cs="Times New Roman"/>
+          <w:sz w:val="24"/>
+          <w:szCs w:val="24"/>
+        </w:rPr>
+        <w:t xml:space="preserve"> pode logar na plataforma</w:t>
+      </w:r>
+      <w:r>
+        <w:rPr>
+          <w:rFonts w:ascii="Times New Roman" w:hAnsi="Times New Roman" w:cs="Times New Roman"/>
+          <w:sz w:val="24"/>
+          <w:szCs w:val="24"/>
+        </w:rPr>
+        <w:t>.</w:t>
+      </w:r>
+    </w:p>
+    <w:p xmlns:wp14="http://schemas.microsoft.com/office/word/2010/wordml" wp14:textId="3199D33F">
+      <w:pPr>
+        <w:rPr>
+          <w:rFonts w:ascii="Times New Roman" w:hAnsi="Times New Roman" w:cs="Times New Roman"/>
+          <w:sz w:val="24"/>
+          <w:szCs w:val="24"/>
+        </w:rPr>
+      </w:pPr>
+      <w:r>
+        <w:rPr>
+          <w:rFonts w:ascii="Times New Roman" w:hAnsi="Times New Roman" w:cs="Times New Roman"/>
+          <w:sz w:val="24"/>
+          <w:szCs w:val="24"/>
+        </w:rPr>
+        <w:t>Prioridade:</w:t>
+      </w:r>
       <w:r>
         <w:rPr>
           <w:rFonts w:ascii="Times New Roman" w:hAnsi="Times New Roman" w:cs="Times New Roman"/>
@@ -334,22 +405,29 @@
         </w:rPr>
         <w:t xml:space="preserve"> </w:t>
       </w:r>
-    </w:p>
-    <w:p>
-      <w:pPr>
-        <w:rPr>
-          <w:rFonts w:ascii="Times New Roman" w:hAnsi="Times New Roman" w:cs="Times New Roman"/>
-          <w:sz w:val="24"/>
-          <w:szCs w:val="24"/>
-        </w:rPr>
-      </w:pPr>
-      <w:r>
-        <w:rPr>
-          <w:rFonts w:ascii="Times New Roman" w:hAnsi="Times New Roman" w:cs="Times New Roman"/>
-          <w:sz w:val="24"/>
-          <w:szCs w:val="24"/>
-        </w:rPr>
-        <w:t>Prioridade:</w:t>
+      <w:r>
+        <w:rPr>
+          <w:rFonts w:ascii="Times New Roman" w:hAnsi="Times New Roman" w:cs="Times New Roman"/>
+          <w:sz w:val="24"/>
+          <w:szCs w:val="24"/>
+        </w:rPr>
+        <w:t>(</w:t>
+      </w:r>
+      <w:r>
+        <w:rPr>
+          <w:rFonts w:ascii="Times New Roman" w:hAnsi="Times New Roman" w:cs="Times New Roman"/>
+          <w:sz w:val="24"/>
+          <w:szCs w:val="24"/>
+        </w:rPr>
+        <w:t>X</w:t>
+      </w:r>
+      <w:r>
+        <w:rPr>
+          <w:rFonts w:ascii="Times New Roman" w:hAnsi="Times New Roman" w:cs="Times New Roman"/>
+          <w:sz w:val="24"/>
+          <w:szCs w:val="24"/>
+        </w:rPr>
+        <w:t>)</w:t>
       </w:r>
       <w:r>
         <w:rPr>
@@ -359,14 +437,111 @@
         </w:rPr>
         <w:t xml:space="preserve"> </w:t>
       </w:r>
-      <w:proofErr w:type="gramStart"/>
-      <w:r>
-        <w:rPr>
-          <w:rFonts w:ascii="Times New Roman" w:hAnsi="Times New Roman" w:cs="Times New Roman"/>
-          <w:sz w:val="24"/>
-          <w:szCs w:val="24"/>
-        </w:rPr>
-        <w:t>(</w:t>
+      <w:r>
+        <w:rPr>
+          <w:rFonts w:ascii="Times New Roman" w:hAnsi="Times New Roman" w:cs="Times New Roman"/>
+          <w:sz w:val="24"/>
+          <w:szCs w:val="24"/>
+        </w:rPr>
+        <w:t>e</w:t>
+      </w:r>
+      <w:r>
+        <w:rPr>
+          <w:rFonts w:ascii="Times New Roman" w:hAnsi="Times New Roman" w:cs="Times New Roman"/>
+          <w:sz w:val="24"/>
+          <w:szCs w:val="24"/>
+        </w:rPr>
+        <w:t>ssencial</w:t>
+      </w:r>
+      <w:r>
+        <w:rPr>
+          <w:rFonts w:ascii="Times New Roman" w:hAnsi="Times New Roman" w:cs="Times New Roman"/>
+          <w:sz w:val="24"/>
+          <w:szCs w:val="24"/>
+        </w:rPr>
+        <w:t xml:space="preserve">   (</w:t>
+      </w:r>
+      <w:r>
+        <w:rPr>
+          <w:rFonts w:ascii="Times New Roman" w:hAnsi="Times New Roman" w:cs="Times New Roman"/>
+          <w:sz w:val="24"/>
+          <w:szCs w:val="24"/>
+        </w:rPr>
+        <w:t xml:space="preserve">) </w:t>
+      </w:r>
+      <w:r>
+        <w:rPr>
+          <w:rFonts w:ascii="Times New Roman" w:hAnsi="Times New Roman" w:cs="Times New Roman"/>
+          <w:sz w:val="24"/>
+          <w:szCs w:val="24"/>
+        </w:rPr>
+        <w:t>i</w:t>
+      </w:r>
+      <w:r>
+        <w:rPr>
+          <w:rFonts w:ascii="Times New Roman" w:hAnsi="Times New Roman" w:cs="Times New Roman"/>
+          <w:sz w:val="24"/>
+          <w:szCs w:val="24"/>
+        </w:rPr>
+        <w:t>mportante  (</w:t>
+      </w:r>
+      <w:r>
+        <w:rPr>
+          <w:rFonts w:ascii="Times New Roman" w:hAnsi="Times New Roman" w:cs="Times New Roman"/>
+          <w:sz w:val="24"/>
+          <w:szCs w:val="24"/>
+        </w:rPr>
+        <w:t xml:space="preserve"> ) </w:t>
+      </w:r>
+      <w:r>
+        <w:rPr>
+          <w:rFonts w:ascii="Times New Roman" w:hAnsi="Times New Roman" w:cs="Times New Roman"/>
+          <w:sz w:val="24"/>
+          <w:szCs w:val="24"/>
+        </w:rPr>
+        <w:t>d</w:t>
+      </w:r>
+      <w:r>
+        <w:rPr>
+          <w:rFonts w:ascii="Times New Roman" w:hAnsi="Times New Roman" w:cs="Times New Roman"/>
+          <w:sz w:val="24"/>
+          <w:szCs w:val="24"/>
+        </w:rPr>
+        <w:t>esejável</w:t>
+      </w:r>
+    </w:p>
+    <w:p xmlns:wp14="http://schemas.microsoft.com/office/word/2010/wordml" wp14:textId="77777777">
+      <w:pPr>
+        <w:rPr>
+          <w:rFonts w:ascii="Times New Roman" w:hAnsi="Times New Roman" w:cs="Times New Roman"/>
+          <w:sz w:val="24"/>
+          <w:szCs w:val="24"/>
+        </w:rPr>
+      </w:pPr>
+    </w:p>
+    <w:p xmlns:wp14="http://schemas.microsoft.com/office/word/2010/wordml" wp14:textId="50720423">
+      <w:pPr>
+        <w:rPr>
+          <w:rFonts w:ascii="Times New Roman" w:hAnsi="Times New Roman" w:cs="Times New Roman"/>
+          <w:sz w:val="24"/>
+          <w:szCs w:val="24"/>
+        </w:rPr>
+      </w:pPr>
+      <w:r>
+        <w:rPr>
+          <w:rFonts w:ascii="Times New Roman" w:hAnsi="Times New Roman" w:cs="Times New Roman"/>
+          <w:sz w:val="24"/>
+          <w:szCs w:val="24"/>
+        </w:rPr>
+        <w:t xml:space="preserve">RF 2 </w:t>
+      </w:r>
+      <w:r>
+        <w:rPr>
+          <w:rFonts w:ascii="Times New Roman" w:hAnsi="Times New Roman" w:cs="Times New Roman"/>
+          <w:sz w:val="24"/>
+          <w:szCs w:val="24"/>
+        </w:rPr>
+        <w:t xml:space="preserve">– </w:t>
       </w:r>
       <w:r>
         <w:rPr>
@@ -382,9 +557,98 @@
           <w:sz w:val="24"/>
           <w:szCs w:val="24"/>
         </w:rPr>
+        <w:t>Cadastr</w:t>
+      </w:r>
+      <w:r>
+        <w:rPr>
+          <w:rFonts w:ascii="Times New Roman" w:hAnsi="Times New Roman" w:cs="Times New Roman"/>
+          <w:sz w:val="24"/>
+          <w:szCs w:val="24"/>
+        </w:rPr>
+        <w:t>o de usuário</w:t>
+      </w:r>
+    </w:p>
+    <w:p xmlns:wp14="http://schemas.microsoft.com/office/word/2010/wordml" wp14:textId="4505EAFB">
+      <w:pPr>
+        <w:rPr>
+          <w:rFonts w:ascii="Times New Roman" w:hAnsi="Times New Roman" w:cs="Times New Roman"/>
+          <w:sz w:val="24"/>
+          <w:szCs w:val="24"/>
+        </w:rPr>
+      </w:pPr>
+      <w:r>
+        <w:rPr>
+          <w:rFonts w:ascii="Times New Roman" w:hAnsi="Times New Roman" w:cs="Times New Roman"/>
+          <w:sz w:val="24"/>
+          <w:szCs w:val="24"/>
+        </w:rPr>
+        <w:t>Descrição:</w:t>
+      </w:r>
+      <w:r>
+        <w:rPr>
+          <w:rFonts w:ascii="Times New Roman" w:hAnsi="Times New Roman" w:cs="Times New Roman"/>
+          <w:sz w:val="24"/>
+          <w:szCs w:val="24"/>
+        </w:rPr>
+        <w:t xml:space="preserve"> </w:t>
+      </w:r>
+      <w:r>
+        <w:rPr>
+          <w:rFonts w:ascii="Times New Roman" w:hAnsi="Times New Roman" w:cs="Times New Roman"/>
+          <w:sz w:val="24"/>
+          <w:szCs w:val="24"/>
+        </w:rPr>
+        <w:t xml:space="preserve">uma tela na qual o </w:t>
+      </w:r>
+      <w:r>
+        <w:rPr>
+          <w:rFonts w:ascii="Times New Roman" w:hAnsi="Times New Roman" w:cs="Times New Roman"/>
+          <w:sz w:val="24"/>
+          <w:szCs w:val="24"/>
+        </w:rPr>
+        <w:t>usuario</w:t>
+      </w:r>
+      <w:r>
+        <w:rPr>
+          <w:rFonts w:ascii="Times New Roman" w:hAnsi="Times New Roman" w:cs="Times New Roman"/>
+          <w:sz w:val="24"/>
+          <w:szCs w:val="24"/>
+        </w:rPr>
+        <w:t xml:space="preserve"> possa se cadastrar e acessar a plataforma</w:t>
+      </w:r>
+    </w:p>
+    <w:p xmlns:wp14="http://schemas.microsoft.com/office/word/2010/wordml" wp14:textId="5F05A1D7">
+      <w:pPr>
+        <w:rPr>
+          <w:rFonts w:ascii="Times New Roman" w:hAnsi="Times New Roman" w:cs="Times New Roman"/>
+          <w:sz w:val="24"/>
+          <w:szCs w:val="24"/>
+        </w:rPr>
+      </w:pPr>
+      <w:r>
+        <w:rPr>
+          <w:rFonts w:ascii="Times New Roman" w:hAnsi="Times New Roman" w:cs="Times New Roman"/>
+          <w:sz w:val="24"/>
+          <w:szCs w:val="24"/>
+        </w:rPr>
+        <w:t>Prioridade: (</w:t>
+      </w:r>
+      <w:r>
+        <w:rPr>
+          <w:rFonts w:ascii="Times New Roman" w:hAnsi="Times New Roman" w:cs="Times New Roman"/>
+          <w:sz w:val="24"/>
+          <w:szCs w:val="24"/>
+        </w:rPr>
+        <w:t>X</w:t>
+      </w:r>
+      <w:r>
+        <w:rPr>
+          <w:rFonts w:ascii="Times New Roman" w:hAnsi="Times New Roman" w:cs="Times New Roman"/>
+          <w:sz w:val="24"/>
+          <w:szCs w:val="24"/>
+        </w:rPr>
         <w:t>)</w:t>
       </w:r>
-      <w:proofErr w:type="gramEnd"/>
       <w:r>
         <w:rPr>
           <w:rFonts w:ascii="Times New Roman" w:hAnsi="Times New Roman" w:cs="Times New Roman"/>
@@ -407,7 +671,23 @@
           <w:sz w:val="24"/>
           <w:szCs w:val="24"/>
         </w:rPr>
-        <w:t xml:space="preserve">ssencial   ( ) </w:t>
+        <w:t>ssencial</w:t>
+      </w:r>
+      <w:r>
+        <w:rPr>
+          <w:rFonts w:ascii="Times New Roman" w:hAnsi="Times New Roman" w:cs="Times New Roman"/>
+          <w:sz w:val="24"/>
+          <w:szCs w:val="24"/>
+        </w:rPr>
+        <w:t xml:space="preserve">   (</w:t>
+      </w:r>
+      <w:r>
+        <w:rPr>
+          <w:rFonts w:ascii="Times New Roman" w:hAnsi="Times New Roman" w:cs="Times New Roman"/>
+          <w:sz w:val="24"/>
+          <w:szCs w:val="24"/>
+        </w:rPr>
+        <w:t xml:space="preserve"> ) </w:t>
       </w:r>
       <w:r>
         <w:rPr>
@@ -423,7 +703,15 @@
           <w:sz w:val="24"/>
           <w:szCs w:val="24"/>
         </w:rPr>
-        <w:t xml:space="preserve">mportante  ( ) </w:t>
+        <w:t>mportante  (</w:t>
+      </w:r>
+      <w:r>
+        <w:rPr>
+          <w:rFonts w:ascii="Times New Roman" w:hAnsi="Times New Roman" w:cs="Times New Roman"/>
+          <w:sz w:val="24"/>
+          <w:szCs w:val="24"/>
+        </w:rPr>
+        <w:t xml:space="preserve"> ) </w:t>
       </w:r>
       <w:r>
         <w:rPr>
@@ -465,34 +753,364 @@
           <w:sz w:val="24"/>
           <w:szCs w:val="24"/>
         </w:rPr>
-        <w:t>RF 2 – Título do requisito (nomear com verbo)</w:t>
-      </w:r>
-    </w:p>
-    <w:p>
-      <w:pPr>
-        <w:rPr>
-          <w:rFonts w:ascii="Times New Roman" w:hAnsi="Times New Roman" w:cs="Times New Roman"/>
-          <w:sz w:val="24"/>
-          <w:szCs w:val="24"/>
-        </w:rPr>
-      </w:pPr>
-      <w:r>
-        <w:rPr>
-          <w:rFonts w:ascii="Times New Roman" w:hAnsi="Times New Roman" w:cs="Times New Roman"/>
-          <w:sz w:val="24"/>
-          <w:szCs w:val="24"/>
-        </w:rPr>
-        <w:t>Descrição:</w:t>
-      </w:r>
-    </w:p>
-    <w:p>
-      <w:pPr>
-        <w:rPr>
-          <w:rFonts w:ascii="Times New Roman" w:hAnsi="Times New Roman" w:cs="Times New Roman"/>
-          <w:sz w:val="24"/>
-          <w:szCs w:val="24"/>
-        </w:rPr>
-      </w:pPr>
+        <w:t>RF 3 – Cadastro de pet</w:t>
+      </w:r>
+    </w:p>
+    <w:p>
+      <w:pPr>
+        <w:rPr>
+          <w:rFonts w:ascii="Times New Roman" w:hAnsi="Times New Roman" w:cs="Times New Roman"/>
+          <w:sz w:val="24"/>
+          <w:szCs w:val="24"/>
+        </w:rPr>
+      </w:pPr>
+      <w:r>
+        <w:rPr>
+          <w:rFonts w:ascii="Times New Roman" w:hAnsi="Times New Roman" w:cs="Times New Roman"/>
+          <w:sz w:val="24"/>
+          <w:szCs w:val="24"/>
+        </w:rPr>
+        <w:t>Descrição: uma tela na qual o usuario possa cadastrar seus pets</w:t>
+      </w:r>
+    </w:p>
+    <w:p>
+      <w:pPr>
+        <w:rPr>
+          <w:rFonts w:ascii="Times New Roman" w:hAnsi="Times New Roman" w:cs="Times New Roman"/>
+          <w:sz w:val="24"/>
+          <w:szCs w:val="24"/>
+        </w:rPr>
+      </w:pPr>
+      <w:r>
+        <w:rPr>
+          <w:rFonts w:ascii="Times New Roman" w:hAnsi="Times New Roman" w:cs="Times New Roman"/>
+          <w:sz w:val="24"/>
+          <w:szCs w:val="24"/>
+        </w:rPr>
+        <w:t>Prioridade: (X) essencial</w:t>
+      </w:r>
+      <w:r>
+        <w:rPr>
+          <w:rFonts w:ascii="Times New Roman" w:hAnsi="Times New Roman" w:cs="Times New Roman"/>
+          <w:sz w:val="24"/>
+          <w:szCs w:val="24"/>
+        </w:rPr>
+        <w:t xml:space="preserve">   (</w:t>
+      </w:r>
+      <w:r>
+        <w:rPr>
+          <w:rFonts w:ascii="Times New Roman" w:hAnsi="Times New Roman" w:cs="Times New Roman"/>
+          <w:sz w:val="24"/>
+          <w:szCs w:val="24"/>
+        </w:rPr>
+        <w:t xml:space="preserve"> ) </w:t>
+      </w:r>
+      <w:r>
+        <w:rPr>
+          <w:rFonts w:ascii="Times New Roman" w:hAnsi="Times New Roman" w:cs="Times New Roman"/>
+          <w:sz w:val="24"/>
+          <w:szCs w:val="24"/>
+        </w:rPr>
+        <w:t>importante  (</w:t>
+      </w:r>
+      <w:r>
+        <w:rPr>
+          <w:rFonts w:ascii="Times New Roman" w:hAnsi="Times New Roman" w:cs="Times New Roman"/>
+          <w:sz w:val="24"/>
+          <w:szCs w:val="24"/>
+        </w:rPr>
+        <w:t xml:space="preserve"> ) desejável</w:t>
+      </w:r>
+    </w:p>
+    <w:p>
+      <w:pPr>
+        <w:rPr>
+          <w:rFonts w:ascii="Times New Roman" w:hAnsi="Times New Roman" w:cs="Times New Roman"/>
+          <w:sz w:val="24"/>
+          <w:szCs w:val="24"/>
+        </w:rPr>
+      </w:pPr>
+    </w:p>
+    <w:p>
+      <w:pPr>
+        <w:rPr>
+          <w:rFonts w:ascii="Times New Roman" w:hAnsi="Times New Roman" w:cs="Times New Roman"/>
+          <w:sz w:val="24"/>
+          <w:szCs w:val="24"/>
+        </w:rPr>
+      </w:pPr>
+      <w:r>
+        <w:rPr>
+          <w:rFonts w:ascii="Times New Roman" w:hAnsi="Times New Roman" w:cs="Times New Roman"/>
+          <w:sz w:val="24"/>
+          <w:szCs w:val="24"/>
+        </w:rPr>
+        <w:t xml:space="preserve">RF </w:t>
+      </w:r>
+      <w:r>
+        <w:rPr>
+          <w:rFonts w:ascii="Times New Roman" w:hAnsi="Times New Roman" w:cs="Times New Roman"/>
+          <w:sz w:val="24"/>
+          <w:szCs w:val="24"/>
+        </w:rPr>
+        <w:t>4  –</w:t>
+      </w:r>
+      <w:r>
+        <w:rPr>
+          <w:rFonts w:ascii="Times New Roman" w:hAnsi="Times New Roman" w:cs="Times New Roman"/>
+          <w:sz w:val="24"/>
+          <w:szCs w:val="24"/>
+        </w:rPr>
+        <w:t xml:space="preserve">  </w:t>
+      </w:r>
+      <w:r>
+        <w:rPr>
+          <w:rFonts w:ascii="Times New Roman" w:hAnsi="Times New Roman" w:cs="Times New Roman"/>
+          <w:sz w:val="24"/>
+          <w:szCs w:val="24"/>
+        </w:rPr>
+        <w:t xml:space="preserve">Adicionar dados de </w:t>
+      </w:r>
+      <w:r>
+        <w:rPr>
+          <w:rFonts w:ascii="Times New Roman" w:hAnsi="Times New Roman" w:cs="Times New Roman"/>
+          <w:sz w:val="24"/>
+          <w:szCs w:val="24"/>
+        </w:rPr>
+        <w:t>vacinação</w:t>
+      </w:r>
+      <w:r>
+        <w:rPr>
+          <w:rFonts w:ascii="Times New Roman" w:hAnsi="Times New Roman" w:cs="Times New Roman"/>
+          <w:sz w:val="24"/>
+          <w:szCs w:val="24"/>
+        </w:rPr>
+        <w:t xml:space="preserve"> do pet</w:t>
+      </w:r>
+    </w:p>
+    <w:p>
+      <w:pPr>
+        <w:rPr>
+          <w:rFonts w:ascii="Times New Roman" w:hAnsi="Times New Roman" w:cs="Times New Roman"/>
+          <w:sz w:val="24"/>
+          <w:szCs w:val="24"/>
+        </w:rPr>
+      </w:pPr>
+      <w:r>
+        <w:rPr>
+          <w:rFonts w:ascii="Times New Roman" w:hAnsi="Times New Roman" w:cs="Times New Roman"/>
+          <w:sz w:val="24"/>
+          <w:szCs w:val="24"/>
+        </w:rPr>
+        <w:t xml:space="preserve">Descrição: </w:t>
+      </w:r>
+      <w:r>
+        <w:rPr>
+          <w:rFonts w:ascii="Times New Roman" w:hAnsi="Times New Roman" w:cs="Times New Roman"/>
+          <w:sz w:val="24"/>
+          <w:szCs w:val="24"/>
+        </w:rPr>
+        <w:t>uma opção de adicionar os dados de vacinação</w:t>
+      </w:r>
+      <w:r>
+        <w:rPr>
+          <w:rFonts w:ascii="Times New Roman" w:hAnsi="Times New Roman" w:cs="Times New Roman"/>
+          <w:sz w:val="24"/>
+          <w:szCs w:val="24"/>
+        </w:rPr>
+        <w:t xml:space="preserve"> do animal</w:t>
+      </w:r>
+    </w:p>
+    <w:p>
+      <w:pPr>
+        <w:rPr>
+          <w:rFonts w:ascii="Times New Roman" w:hAnsi="Times New Roman" w:cs="Times New Roman"/>
+          <w:sz w:val="24"/>
+          <w:szCs w:val="24"/>
+        </w:rPr>
+      </w:pPr>
+      <w:r>
+        <w:rPr>
+          <w:rFonts w:ascii="Times New Roman" w:hAnsi="Times New Roman" w:cs="Times New Roman"/>
+          <w:sz w:val="24"/>
+          <w:szCs w:val="24"/>
+        </w:rPr>
+        <w:t>Prioridade: (X) essencial</w:t>
+      </w:r>
+      <w:r>
+        <w:rPr>
+          <w:rFonts w:ascii="Times New Roman" w:hAnsi="Times New Roman" w:cs="Times New Roman"/>
+          <w:sz w:val="24"/>
+          <w:szCs w:val="24"/>
+        </w:rPr>
+        <w:t xml:space="preserve">   (</w:t>
+      </w:r>
+      <w:r>
+        <w:rPr>
+          <w:rFonts w:ascii="Times New Roman" w:hAnsi="Times New Roman" w:cs="Times New Roman"/>
+          <w:sz w:val="24"/>
+          <w:szCs w:val="24"/>
+        </w:rPr>
+        <w:t xml:space="preserve"> ) </w:t>
+      </w:r>
+      <w:r>
+        <w:rPr>
+          <w:rFonts w:ascii="Times New Roman" w:hAnsi="Times New Roman" w:cs="Times New Roman"/>
+          <w:sz w:val="24"/>
+          <w:szCs w:val="24"/>
+        </w:rPr>
+        <w:t>importante  (</w:t>
+      </w:r>
+      <w:r>
+        <w:rPr>
+          <w:rFonts w:ascii="Times New Roman" w:hAnsi="Times New Roman" w:cs="Times New Roman"/>
+          <w:sz w:val="24"/>
+          <w:szCs w:val="24"/>
+        </w:rPr>
+        <w:t xml:space="preserve"> ) desejável</w:t>
+      </w:r>
+    </w:p>
+    <w:p>
+      <w:pPr>
+        <w:rPr>
+          <w:rFonts w:ascii="Times New Roman" w:hAnsi="Times New Roman" w:cs="Times New Roman"/>
+          <w:sz w:val="24"/>
+          <w:szCs w:val="24"/>
+        </w:rPr>
+      </w:pPr>
+    </w:p>
+    <w:p>
+      <w:pPr>
+        <w:rPr>
+          <w:rFonts w:ascii="Times New Roman" w:hAnsi="Times New Roman" w:cs="Times New Roman"/>
+          <w:sz w:val="24"/>
+          <w:szCs w:val="24"/>
+        </w:rPr>
+      </w:pPr>
+      <w:r>
+        <w:rPr>
+          <w:rFonts w:ascii="Times New Roman" w:hAnsi="Times New Roman" w:cs="Times New Roman"/>
+          <w:sz w:val="24"/>
+          <w:szCs w:val="24"/>
+        </w:rPr>
+        <w:t>RF 5</w:t>
+      </w:r>
+      <w:r>
+        <w:rPr>
+          <w:rFonts w:ascii="Times New Roman" w:hAnsi="Times New Roman" w:cs="Times New Roman"/>
+          <w:sz w:val="24"/>
+          <w:szCs w:val="24"/>
+        </w:rPr>
+        <w:t xml:space="preserve">  –</w:t>
+      </w:r>
+      <w:r>
+        <w:rPr>
+          <w:rFonts w:ascii="Times New Roman" w:hAnsi="Times New Roman" w:cs="Times New Roman"/>
+          <w:sz w:val="24"/>
+          <w:szCs w:val="24"/>
+        </w:rPr>
+        <w:t xml:space="preserve">  Adicionar pedigree do pet</w:t>
+      </w:r>
+    </w:p>
+    <w:p>
+      <w:pPr>
+        <w:rPr>
+          <w:rFonts w:ascii="Times New Roman" w:hAnsi="Times New Roman" w:cs="Times New Roman"/>
+          <w:sz w:val="24"/>
+          <w:szCs w:val="24"/>
+        </w:rPr>
+      </w:pPr>
+      <w:r>
+        <w:rPr>
+          <w:rFonts w:ascii="Times New Roman" w:hAnsi="Times New Roman" w:cs="Times New Roman"/>
+          <w:sz w:val="24"/>
+          <w:szCs w:val="24"/>
+        </w:rPr>
+        <w:t>Descrição: uma opção de adicionar o certificado de pedigree do pet</w:t>
+      </w:r>
+    </w:p>
+    <w:p>
+      <w:pPr>
+        <w:rPr>
+          <w:rFonts w:ascii="Times New Roman" w:hAnsi="Times New Roman" w:cs="Times New Roman"/>
+          <w:sz w:val="24"/>
+          <w:szCs w:val="24"/>
+        </w:rPr>
+      </w:pPr>
+      <w:r>
+        <w:rPr>
+          <w:rFonts w:ascii="Times New Roman" w:hAnsi="Times New Roman" w:cs="Times New Roman"/>
+          <w:sz w:val="24"/>
+          <w:szCs w:val="24"/>
+        </w:rPr>
+        <w:t>Prioridade: (X) essencial</w:t>
+      </w:r>
+      <w:r>
+        <w:rPr>
+          <w:rFonts w:ascii="Times New Roman" w:hAnsi="Times New Roman" w:cs="Times New Roman"/>
+          <w:sz w:val="24"/>
+          <w:szCs w:val="24"/>
+        </w:rPr>
+        <w:t xml:space="preserve">   (</w:t>
+      </w:r>
+      <w:r>
+        <w:rPr>
+          <w:rFonts w:ascii="Times New Roman" w:hAnsi="Times New Roman" w:cs="Times New Roman"/>
+          <w:sz w:val="24"/>
+          <w:szCs w:val="24"/>
+        </w:rPr>
+        <w:t xml:space="preserve"> ) </w:t>
+      </w:r>
+      <w:r>
+        <w:rPr>
+          <w:rFonts w:ascii="Times New Roman" w:hAnsi="Times New Roman" w:cs="Times New Roman"/>
+          <w:sz w:val="24"/>
+          <w:szCs w:val="24"/>
+        </w:rPr>
+        <w:t>importante  (</w:t>
+      </w:r>
+      <w:r>
+        <w:rPr>
+          <w:rFonts w:ascii="Times New Roman" w:hAnsi="Times New Roman" w:cs="Times New Roman"/>
+          <w:sz w:val="24"/>
+          <w:szCs w:val="24"/>
+        </w:rPr>
+        <w:t xml:space="preserve"> ) desejável</w:t>
+      </w:r>
+    </w:p>
+    <w:p>
+      <w:pPr>
+        <w:rPr>
+          <w:rFonts w:ascii="Times New Roman" w:hAnsi="Times New Roman" w:cs="Times New Roman"/>
+          <w:sz w:val="24"/>
+          <w:szCs w:val="24"/>
+        </w:rPr>
+      </w:pPr>
+    </w:p>
+    <w:p>
+      <w:pPr>
+        <w:rPr>
+          <w:rFonts w:ascii="Times New Roman" w:hAnsi="Times New Roman" w:cs="Times New Roman"/>
+          <w:sz w:val="24"/>
+          <w:szCs w:val="24"/>
+        </w:rPr>
+      </w:pPr>
+      <w:r>
+        <w:rPr>
+          <w:rFonts w:ascii="Times New Roman" w:hAnsi="Times New Roman" w:cs="Times New Roman"/>
+          <w:sz w:val="24"/>
+          <w:szCs w:val="24"/>
+        </w:rPr>
+        <w:t xml:space="preserve">RF </w:t>
+      </w:r>
+      <w:r>
+        <w:rPr>
+          <w:rFonts w:ascii="Times New Roman" w:hAnsi="Times New Roman" w:cs="Times New Roman"/>
+          <w:sz w:val="24"/>
+          <w:szCs w:val="24"/>
+        </w:rPr>
+        <w:t>6  –</w:t>
+      </w:r>
       <w:r>
         <w:rPr>
           <w:rFonts w:ascii="Times New Roman" w:hAnsi="Times New Roman" w:cs="Times New Roman"/>
@@ -501,89 +1119,312 @@
         </w:rPr>
         <w:t xml:space="preserve"> </w:t>
       </w:r>
-    </w:p>
-    <w:p>
-      <w:pPr>
-        <w:rPr>
-          <w:rFonts w:ascii="Times New Roman" w:hAnsi="Times New Roman" w:cs="Times New Roman"/>
-          <w:sz w:val="24"/>
-          <w:szCs w:val="24"/>
-        </w:rPr>
-      </w:pPr>
-      <w:r>
-        <w:rPr>
-          <w:rFonts w:ascii="Times New Roman" w:hAnsi="Times New Roman" w:cs="Times New Roman"/>
-          <w:sz w:val="24"/>
-          <w:szCs w:val="24"/>
-        </w:rPr>
-        <w:t xml:space="preserve">Prioridade: ( </w:t>
-      </w:r>
-      <w:r>
-        <w:rPr>
-          <w:rFonts w:ascii="Times New Roman" w:hAnsi="Times New Roman" w:cs="Times New Roman"/>
-          <w:sz w:val="24"/>
-          <w:szCs w:val="24"/>
-        </w:rPr>
-        <w:t>)</w:t>
-      </w:r>
-      <w:r>
-        <w:rPr>
-          <w:rFonts w:ascii="Times New Roman" w:hAnsi="Times New Roman" w:cs="Times New Roman"/>
-          <w:sz w:val="24"/>
-          <w:szCs w:val="24"/>
-        </w:rPr>
-        <w:t xml:space="preserve"> </w:t>
-      </w:r>
-      <w:r>
-        <w:rPr>
-          <w:rFonts w:ascii="Times New Roman" w:hAnsi="Times New Roman" w:cs="Times New Roman"/>
-          <w:sz w:val="24"/>
-          <w:szCs w:val="24"/>
-        </w:rPr>
-        <w:t>e</w:t>
-      </w:r>
-      <w:r>
-        <w:rPr>
-          <w:rFonts w:ascii="Times New Roman" w:hAnsi="Times New Roman" w:cs="Times New Roman"/>
-          <w:sz w:val="24"/>
-          <w:szCs w:val="24"/>
-        </w:rPr>
-        <w:t xml:space="preserve">ssencial   ( ) </w:t>
-      </w:r>
-      <w:r>
-        <w:rPr>
-          <w:rFonts w:ascii="Times New Roman" w:hAnsi="Times New Roman" w:cs="Times New Roman"/>
-          <w:sz w:val="24"/>
-          <w:szCs w:val="24"/>
-        </w:rPr>
-        <w:t>i</w:t>
-      </w:r>
-      <w:r>
-        <w:rPr>
-          <w:rFonts w:ascii="Times New Roman" w:hAnsi="Times New Roman" w:cs="Times New Roman"/>
-          <w:sz w:val="24"/>
-          <w:szCs w:val="24"/>
-        </w:rPr>
-        <w:t xml:space="preserve">mportante  ( ) </w:t>
-      </w:r>
-      <w:r>
-        <w:rPr>
-          <w:rFonts w:ascii="Times New Roman" w:hAnsi="Times New Roman" w:cs="Times New Roman"/>
-          <w:sz w:val="24"/>
-          <w:szCs w:val="24"/>
-        </w:rPr>
-        <w:t>d</w:t>
-      </w:r>
-      <w:r>
-        <w:rPr>
-          <w:rFonts w:ascii="Times New Roman" w:hAnsi="Times New Roman" w:cs="Times New Roman"/>
-          <w:sz w:val="24"/>
-          <w:szCs w:val="24"/>
-        </w:rPr>
-        <w:t>esejável</w:t>
-      </w:r>
-    </w:p>
-    <w:p>
+      <w:r>
+        <w:rPr>
+          <w:rFonts w:ascii="Times New Roman" w:hAnsi="Times New Roman" w:cs="Times New Roman"/>
+          <w:sz w:val="24"/>
+          <w:szCs w:val="24"/>
+        </w:rPr>
+        <w:t xml:space="preserve"> Cadastrar empresa</w:t>
+      </w:r>
+    </w:p>
+    <w:p>
+      <w:pPr>
+        <w:rPr>
+          <w:rFonts w:ascii="Times New Roman" w:hAnsi="Times New Roman" w:cs="Times New Roman"/>
+          <w:sz w:val="24"/>
+          <w:szCs w:val="24"/>
+        </w:rPr>
+      </w:pPr>
+      <w:r>
+        <w:rPr>
+          <w:rFonts w:ascii="Times New Roman" w:hAnsi="Times New Roman" w:cs="Times New Roman"/>
+          <w:sz w:val="24"/>
+          <w:szCs w:val="24"/>
+        </w:rPr>
+        <w:t>Descrição: uma opção de</w:t>
+      </w:r>
+      <w:r>
+        <w:rPr>
+          <w:rFonts w:ascii="Times New Roman" w:hAnsi="Times New Roman" w:cs="Times New Roman"/>
+          <w:sz w:val="24"/>
+          <w:szCs w:val="24"/>
+        </w:rPr>
+        <w:t xml:space="preserve"> se cadastrar como uma empresa usando um CNPJ, dessa forma ONGS podem se cadastrar</w:t>
+      </w:r>
+    </w:p>
+    <w:p>
+      <w:pPr>
+        <w:rPr>
+          <w:rFonts w:ascii="Times New Roman" w:hAnsi="Times New Roman" w:cs="Times New Roman"/>
+          <w:sz w:val="24"/>
+          <w:szCs w:val="24"/>
+        </w:rPr>
+      </w:pPr>
+      <w:r>
+        <w:rPr>
+          <w:rFonts w:ascii="Times New Roman" w:hAnsi="Times New Roman" w:cs="Times New Roman"/>
+          <w:sz w:val="24"/>
+          <w:szCs w:val="24"/>
+        </w:rPr>
+        <w:t>Prioridade: (X) essencial   ( ) importante  ( ) desejável</w:t>
+      </w:r>
+    </w:p>
+    <w:p>
+      <w:pPr>
+        <w:rPr>
+          <w:rFonts w:ascii="Times New Roman" w:hAnsi="Times New Roman" w:cs="Times New Roman"/>
+          <w:sz w:val="24"/>
+          <w:szCs w:val="24"/>
+        </w:rPr>
+      </w:pPr>
+      <w:r>
+        <w:rPr>
+          <w:rFonts w:ascii="Times New Roman" w:hAnsi="Times New Roman" w:cs="Times New Roman"/>
+          <w:sz w:val="24"/>
+          <w:szCs w:val="24"/>
+        </w:rPr>
+        <w:t>RF 7  –  Cadastrar pets para adoção</w:t>
+      </w:r>
+    </w:p>
+    <w:p>
+      <w:pPr>
+        <w:rPr>
+          <w:rFonts w:ascii="Times New Roman" w:hAnsi="Times New Roman" w:cs="Times New Roman"/>
+          <w:sz w:val="24"/>
+          <w:szCs w:val="24"/>
+        </w:rPr>
+      </w:pPr>
+      <w:r>
+        <w:rPr>
+          <w:rFonts w:ascii="Times New Roman" w:hAnsi="Times New Roman" w:cs="Times New Roman"/>
+          <w:sz w:val="24"/>
+          <w:szCs w:val="24"/>
+        </w:rPr>
+        <w:t>Descrição: uma opção de se cadastrar um pet para adoção</w:t>
+      </w:r>
+    </w:p>
+    <w:p>
+      <w:pPr>
+        <w:rPr>
+          <w:rFonts w:ascii="Times New Roman" w:hAnsi="Times New Roman" w:cs="Times New Roman"/>
+          <w:sz w:val="24"/>
+          <w:szCs w:val="24"/>
+        </w:rPr>
+      </w:pPr>
+      <w:r>
+        <w:rPr>
+          <w:rFonts w:ascii="Times New Roman" w:hAnsi="Times New Roman" w:cs="Times New Roman"/>
+          <w:sz w:val="24"/>
+          <w:szCs w:val="24"/>
+        </w:rPr>
+        <w:t>Prioridade: (X) essencial</w:t>
+      </w:r>
+      <w:r>
+        <w:rPr>
+          <w:rFonts w:ascii="Times New Roman" w:hAnsi="Times New Roman" w:cs="Times New Roman"/>
+          <w:sz w:val="24"/>
+          <w:szCs w:val="24"/>
+        </w:rPr>
+        <w:t xml:space="preserve">   (</w:t>
+      </w:r>
+      <w:r>
+        <w:rPr>
+          <w:rFonts w:ascii="Times New Roman" w:hAnsi="Times New Roman" w:cs="Times New Roman"/>
+          <w:sz w:val="24"/>
+          <w:szCs w:val="24"/>
+        </w:rPr>
+        <w:t xml:space="preserve"> ) </w:t>
+      </w:r>
+      <w:r>
+        <w:rPr>
+          <w:rFonts w:ascii="Times New Roman" w:hAnsi="Times New Roman" w:cs="Times New Roman"/>
+          <w:sz w:val="24"/>
+          <w:szCs w:val="24"/>
+        </w:rPr>
+        <w:t>importante  (</w:t>
+      </w:r>
+      <w:r>
+        <w:rPr>
+          <w:rFonts w:ascii="Times New Roman" w:hAnsi="Times New Roman" w:cs="Times New Roman"/>
+          <w:sz w:val="24"/>
+          <w:szCs w:val="24"/>
+        </w:rPr>
+        <w:t xml:space="preserve"> ) desejável</w:t>
+      </w:r>
+    </w:p>
+    <w:p>
+      <w:pPr>
+        <w:rPr>
+          <w:rFonts w:ascii="Times New Roman" w:hAnsi="Times New Roman" w:cs="Times New Roman"/>
+          <w:sz w:val="24"/>
+          <w:szCs w:val="24"/>
+        </w:rPr>
+      </w:pPr>
+    </w:p>
+    <w:p>
+      <w:pPr>
+        <w:rPr>
+          <w:rFonts w:ascii="Times New Roman" w:hAnsi="Times New Roman" w:cs="Times New Roman"/>
+          <w:sz w:val="24"/>
+          <w:szCs w:val="24"/>
+        </w:rPr>
+      </w:pPr>
+      <w:r>
+        <w:rPr>
+          <w:rFonts w:ascii="Times New Roman" w:hAnsi="Times New Roman" w:cs="Times New Roman"/>
+          <w:sz w:val="24"/>
+          <w:szCs w:val="24"/>
+        </w:rPr>
+        <w:t xml:space="preserve">RF </w:t>
+      </w:r>
+      <w:r>
+        <w:rPr>
+          <w:rFonts w:ascii="Times New Roman" w:hAnsi="Times New Roman" w:cs="Times New Roman"/>
+          <w:sz w:val="24"/>
+          <w:szCs w:val="24"/>
+        </w:rPr>
+        <w:t>8  –</w:t>
+      </w:r>
+      <w:r>
+        <w:rPr>
+          <w:rFonts w:ascii="Times New Roman" w:hAnsi="Times New Roman" w:cs="Times New Roman"/>
+          <w:sz w:val="24"/>
+          <w:szCs w:val="24"/>
+        </w:rPr>
+        <w:t xml:space="preserve">  Chat de mensagem</w:t>
+      </w:r>
+    </w:p>
+    <w:p>
+      <w:pPr>
+        <w:rPr>
+          <w:rFonts w:ascii="Times New Roman" w:hAnsi="Times New Roman" w:cs="Times New Roman"/>
+          <w:sz w:val="24"/>
+          <w:szCs w:val="24"/>
+        </w:rPr>
+      </w:pPr>
+      <w:r>
+        <w:rPr>
+          <w:rFonts w:ascii="Times New Roman" w:hAnsi="Times New Roman" w:cs="Times New Roman"/>
+          <w:sz w:val="24"/>
+          <w:szCs w:val="24"/>
+        </w:rPr>
+        <w:t xml:space="preserve">Descrição: uma opção para se comunicar com quem </w:t>
+      </w:r>
+      <w:r>
+        <w:rPr>
+          <w:rFonts w:ascii="Times New Roman" w:hAnsi="Times New Roman" w:cs="Times New Roman"/>
+          <w:sz w:val="24"/>
+          <w:szCs w:val="24"/>
+        </w:rPr>
+        <w:t>esta</w:t>
+      </w:r>
+      <w:r>
+        <w:rPr>
+          <w:rFonts w:ascii="Times New Roman" w:hAnsi="Times New Roman" w:cs="Times New Roman"/>
+          <w:sz w:val="24"/>
+          <w:szCs w:val="24"/>
+        </w:rPr>
+        <w:t xml:space="preserve"> anunciando animais para </w:t>
+      </w:r>
+      <w:r>
+        <w:rPr>
+          <w:rFonts w:ascii="Times New Roman" w:hAnsi="Times New Roman" w:cs="Times New Roman"/>
+          <w:sz w:val="24"/>
+          <w:szCs w:val="24"/>
+        </w:rPr>
+        <w:t>adoção</w:t>
+      </w:r>
+      <w:r>
+        <w:rPr>
+          <w:rFonts w:ascii="Times New Roman" w:hAnsi="Times New Roman" w:cs="Times New Roman"/>
+          <w:sz w:val="24"/>
+          <w:szCs w:val="24"/>
+        </w:rPr>
+        <w:t xml:space="preserve"> de um pet</w:t>
+      </w:r>
+    </w:p>
+    <w:p>
+      <w:pPr>
+        <w:rPr>
+          <w:rFonts w:ascii="Times New Roman" w:hAnsi="Times New Roman" w:cs="Times New Roman"/>
+          <w:sz w:val="24"/>
+          <w:szCs w:val="24"/>
+        </w:rPr>
+      </w:pPr>
+      <w:r>
+        <w:rPr>
+          <w:rFonts w:ascii="Times New Roman" w:hAnsi="Times New Roman" w:cs="Times New Roman"/>
+          <w:sz w:val="24"/>
+          <w:szCs w:val="24"/>
+        </w:rPr>
+        <w:t>Prioridade: (X) essencial   ( ) importante  ( ) desejável</w:t>
+      </w:r>
+    </w:p>
+    <w:p>
+      <w:pPr>
+        <w:rPr>
+          <w:rFonts w:ascii="Times New Roman" w:hAnsi="Times New Roman" w:cs="Times New Roman"/>
+          <w:sz w:val="24"/>
+          <w:szCs w:val="24"/>
+        </w:rPr>
+      </w:pPr>
+    </w:p>
+    <w:p>
+      <w:pPr>
+        <w:rPr>
+          <w:rFonts w:ascii="Times New Roman" w:hAnsi="Times New Roman" w:cs="Times New Roman"/>
+          <w:sz w:val="24"/>
+          <w:szCs w:val="24"/>
+        </w:rPr>
+      </w:pPr>
+    </w:p>
+    <w:p>
+      <w:pPr>
+        <w:rPr>
+          <w:rFonts w:ascii="Times New Roman" w:hAnsi="Times New Roman" w:cs="Times New Roman"/>
+          <w:sz w:val="24"/>
+          <w:szCs w:val="24"/>
+        </w:rPr>
+      </w:pPr>
+    </w:p>
+    <w:p>
+      <w:pPr>
+        <w:rPr>
+          <w:rFonts w:ascii="Times New Roman" w:hAnsi="Times New Roman" w:cs="Times New Roman"/>
+          <w:sz w:val="24"/>
+          <w:szCs w:val="24"/>
+        </w:rPr>
+      </w:pPr>
+    </w:p>
+    <w:p>
+      <w:pPr>
+        <w:rPr>
+          <w:rFonts w:ascii="Times New Roman" w:hAnsi="Times New Roman" w:cs="Times New Roman"/>
+          <w:sz w:val="24"/>
+          <w:szCs w:val="24"/>
+        </w:rPr>
+      </w:pPr>
+    </w:p>
+    <w:p>
+      <w:pPr>
+        <w:rPr>
+          <w:rFonts w:ascii="Times New Roman" w:hAnsi="Times New Roman" w:cs="Times New Roman"/>
+          <w:sz w:val="24"/>
+          <w:szCs w:val="24"/>
+        </w:rPr>
+      </w:pPr>
+    </w:p>
+    <w:p>
+      <w:pPr>
+        <w:rPr>
+          <w:rFonts w:ascii="Times New Roman" w:hAnsi="Times New Roman" w:cs="Times New Roman"/>
+          <w:sz w:val="24"/>
+          <w:szCs w:val="24"/>
+        </w:rPr>
+      </w:pPr>
+    </w:p>
+    <w:p xmlns:wp14="http://schemas.microsoft.com/office/word/2010/wordml" wp14:textId="77777777">
       <w:pPr>
         <w:rPr>
           <w:rFonts w:ascii="Arial" w:hAnsi="Arial" w:cs="Arial"/>
@@ -599,7 +1440,7 @@
       <w:footerReference w:type="default" r:id="rId9"/>
       <w:headerReference w:type="first" r:id="rId10"/>
       <w:footerReference w:type="first" r:id="rId11"/>
-      <w:pgSz w:w="11906" w:h="16838"/>
+      <w:pgSz w:w="11906" w:h="16838" w:orient="portrait"/>
       <w:pgMar w:top="1417" w:right="1701" w:bottom="1417" w:left="1701" w:header="708" w:footer="708" w:gutter="0"/>
       <w:cols w:space="708"/>
       <w:docGrid w:linePitch="360"/>
@@ -611,7 +1452,7 @@
 <file path=word/endnotes.xml><?xml version="1.0" encoding="utf-8"?>
 <w:endnotes xmlns:wpc="http://schemas.microsoft.com/office/word/2010/wordprocessingCanvas" xmlns:cx="http://schemas.microsoft.com/office/drawing/2014/chartex" xmlns:cx1="http://schemas.microsoft.com/office/drawing/2015/9/8/chartex" xmlns:mc="http://schemas.openxmlformats.org/markup-compatibility/2006" xmlns:o="urn:schemas-microsoft-com:office:office" xmlns:r="http://schemas.openxmlformats.org/officeDocument/2006/relationships" xmlns:m="http://schemas.openxmlformats.org/officeDocument/2006/math" xmlns:v="urn:schemas-microsoft-com:vml" xmlns:wp14="http://schemas.microsoft.com/office/word/2010/wordprocessingDrawing" xmlns:wp="http://schemas.openxmlformats.org/drawingml/2006/wordprocessingDrawing" xmlns:w10="urn:schemas-microsoft-com:office:word" xmlns:w="http://schemas.openxmlformats.org/wordprocessingml/2006/main" xmlns:w14="http://schemas.microsoft.com/office/word/2010/wordml" xmlns:w15="http://schemas.microsoft.com/office/word/2012/wordml" xmlns:w16se="http://schemas.microsoft.com/office/word/2015/wordml/symex" xmlns:wpg="http://schemas.microsoft.com/office/word/2010/wordprocessingGroup" xmlns:wpi="http://schemas.microsoft.com/office/word/2010/wordprocessingInk" xmlns:wne="http://schemas.microsoft.com/office/word/2006/wordml" xmlns:wps="http://schemas.microsoft.com/office/word/2010/wordprocessingShape" mc:Ignorable="w14 w15 w16se wp14">
   <w:endnote w:type="separator" w:id="-1">
-    <w:p>
+    <w:p xmlns:wp14="http://schemas.microsoft.com/office/word/2010/wordml" wp14:textId="77777777">
       <w:pPr>
         <w:spacing w:after="0" w:line="240" w:lineRule="auto"/>
       </w:pPr>
@@ -621,7 +1462,7 @@
     </w:p>
   </w:endnote>
   <w:endnote w:type="continuationSeparator" w:id="0">
-    <w:p>
+    <w:p xmlns:wp14="http://schemas.microsoft.com/office/word/2010/wordml" wp14:textId="77777777">
       <w:pPr>
         <w:spacing w:after="0" w:line="240" w:lineRule="auto"/>
       </w:pPr>
@@ -635,7 +1476,7 @@
 
 <file path=word/footer1.xml><?xml version="1.0" encoding="utf-8"?>
 <w:ftr xmlns:wpc="http://schemas.microsoft.com/office/word/2010/wordprocessingCanvas" xmlns:cx="http://schemas.microsoft.com/office/drawing/2014/chartex" xmlns:cx1="http://schemas.microsoft.com/office/drawing/2015/9/8/chartex" xmlns:mc="http://schemas.openxmlformats.org/markup-compatibility/2006" xmlns:o="urn:schemas-microsoft-com:office:office" xmlns:r="http://schemas.openxmlformats.org/officeDocument/2006/relationships" xmlns:m="http://schemas.openxmlformats.org/officeDocument/2006/math" xmlns:v="urn:schemas-microsoft-com:vml" xmlns:wp14="http://schemas.microsoft.com/office/word/2010/wordprocessingDrawing" xmlns:wp="http://schemas.openxmlformats.org/drawingml/2006/wordprocessingDrawing" xmlns:w10="urn:schemas-microsoft-com:office:word" xmlns:w="http://schemas.openxmlformats.org/wordprocessingml/2006/main" xmlns:w14="http://schemas.microsoft.com/office/word/2010/wordml" xmlns:w15="http://schemas.microsoft.com/office/word/2012/wordml" xmlns:w16se="http://schemas.microsoft.com/office/word/2015/wordml/symex" xmlns:wpg="http://schemas.microsoft.com/office/word/2010/wordprocessingGroup" xmlns:wpi="http://schemas.microsoft.com/office/word/2010/wordprocessingInk" xmlns:wne="http://schemas.microsoft.com/office/word/2006/wordml" xmlns:wps="http://schemas.microsoft.com/office/word/2010/wordprocessingShape" mc:Ignorable="w14 w15 w16se wp14">
-  <w:p>
+  <w:p xmlns:wp14="http://schemas.microsoft.com/office/word/2010/wordml" wp14:textId="77777777">
     <w:pPr>
       <w:pStyle w:val="Rodap"/>
     </w:pPr>
@@ -645,7 +1486,7 @@
 
 <file path=word/footer2.xml><?xml version="1.0" encoding="utf-8"?>
 <w:ftr xmlns:wpc="http://schemas.microsoft.com/office/word/2010/wordprocessingCanvas" xmlns:cx="http://schemas.microsoft.com/office/drawing/2014/chartex" xmlns:cx1="http://schemas.microsoft.com/office/drawing/2015/9/8/chartex" xmlns:mc="http://schemas.openxmlformats.org/markup-compatibility/2006" xmlns:o="urn:schemas-microsoft-com:office:office" xmlns:r="http://schemas.openxmlformats.org/officeDocument/2006/relationships" xmlns:m="http://schemas.openxmlformats.org/officeDocument/2006/math" xmlns:v="urn:schemas-microsoft-com:vml" xmlns:wp14="http://schemas.microsoft.com/office/word/2010/wordprocessingDrawing" xmlns:wp="http://schemas.openxmlformats.org/drawingml/2006/wordprocessingDrawing" xmlns:w10="urn:schemas-microsoft-com:office:word" xmlns:w="http://schemas.openxmlformats.org/wordprocessingml/2006/main" xmlns:w14="http://schemas.microsoft.com/office/word/2010/wordml" xmlns:w15="http://schemas.microsoft.com/office/word/2012/wordml" xmlns:w16se="http://schemas.microsoft.com/office/word/2015/wordml/symex" xmlns:wpg="http://schemas.microsoft.com/office/word/2010/wordprocessingGroup" xmlns:wpi="http://schemas.microsoft.com/office/word/2010/wordprocessingInk" xmlns:wne="http://schemas.microsoft.com/office/word/2006/wordml" xmlns:wps="http://schemas.microsoft.com/office/word/2010/wordprocessingShape" mc:Ignorable="w14 w15 w16se wp14">
-  <w:p>
+  <w:p xmlns:wp14="http://schemas.microsoft.com/office/word/2010/wordml" wp14:textId="77777777">
     <w:pPr>
       <w:pStyle w:val="Rodap"/>
       <w:jc w:val="center"/>
@@ -759,7 +1600,7 @@
 
 <file path=word/footer3.xml><?xml version="1.0" encoding="utf-8"?>
 <w:ftr xmlns:wpc="http://schemas.microsoft.com/office/word/2010/wordprocessingCanvas" xmlns:cx="http://schemas.microsoft.com/office/drawing/2014/chartex" xmlns:cx1="http://schemas.microsoft.com/office/drawing/2015/9/8/chartex" xmlns:mc="http://schemas.openxmlformats.org/markup-compatibility/2006" xmlns:o="urn:schemas-microsoft-com:office:office" xmlns:r="http://schemas.openxmlformats.org/officeDocument/2006/relationships" xmlns:m="http://schemas.openxmlformats.org/officeDocument/2006/math" xmlns:v="urn:schemas-microsoft-com:vml" xmlns:wp14="http://schemas.microsoft.com/office/word/2010/wordprocessingDrawing" xmlns:wp="http://schemas.openxmlformats.org/drawingml/2006/wordprocessingDrawing" xmlns:w10="urn:schemas-microsoft-com:office:word" xmlns:w="http://schemas.openxmlformats.org/wordprocessingml/2006/main" xmlns:w14="http://schemas.microsoft.com/office/word/2010/wordml" xmlns:w15="http://schemas.microsoft.com/office/word/2012/wordml" xmlns:w16se="http://schemas.microsoft.com/office/word/2015/wordml/symex" xmlns:wpg="http://schemas.microsoft.com/office/word/2010/wordprocessingGroup" xmlns:wpi="http://schemas.microsoft.com/office/word/2010/wordprocessingInk" xmlns:wne="http://schemas.microsoft.com/office/word/2006/wordml" xmlns:wps="http://schemas.microsoft.com/office/word/2010/wordprocessingShape" mc:Ignorable="w14 w15 w16se wp14">
-  <w:p>
+  <w:p xmlns:wp14="http://schemas.microsoft.com/office/word/2010/wordml" wp14:textId="77777777">
     <w:pPr>
       <w:pStyle w:val="Rodap"/>
     </w:pPr>
@@ -770,7 +1611,7 @@
 <file path=word/footnotes.xml><?xml version="1.0" encoding="utf-8"?>
 <w:footnotes xmlns:wpc="http://schemas.microsoft.com/office/word/2010/wordprocessingCanvas" xmlns:cx="http://schemas.microsoft.com/office/drawing/2014/chartex" xmlns:cx1="http://schemas.microsoft.com/office/drawing/2015/9/8/chartex" xmlns:mc="http://schemas.openxmlformats.org/markup-compatibility/2006" xmlns:o="urn:schemas-microsoft-com:office:office" xmlns:r="http://schemas.openxmlformats.org/officeDocument/2006/relationships" xmlns:m="http://schemas.openxmlformats.org/officeDocument/2006/math" xmlns:v="urn:schemas-microsoft-com:vml" xmlns:wp14="http://schemas.microsoft.com/office/word/2010/wordprocessingDrawing" xmlns:wp="http://schemas.openxmlformats.org/drawingml/2006/wordprocessingDrawing" xmlns:w10="urn:schemas-microsoft-com:office:word" xmlns:w="http://schemas.openxmlformats.org/wordprocessingml/2006/main" xmlns:w14="http://schemas.microsoft.com/office/word/2010/wordml" xmlns:w15="http://schemas.microsoft.com/office/word/2012/wordml" xmlns:w16se="http://schemas.microsoft.com/office/word/2015/wordml/symex" xmlns:wpg="http://schemas.microsoft.com/office/word/2010/wordprocessingGroup" xmlns:wpi="http://schemas.microsoft.com/office/word/2010/wordprocessingInk" xmlns:wne="http://schemas.microsoft.com/office/word/2006/wordml" xmlns:wps="http://schemas.microsoft.com/office/word/2010/wordprocessingShape" mc:Ignorable="w14 w15 w16se wp14">
   <w:footnote w:type="separator" w:id="-1">
-    <w:p>
+    <w:p xmlns:wp14="http://schemas.microsoft.com/office/word/2010/wordml" wp14:textId="77777777">
       <w:pPr>
         <w:spacing w:after="0" w:line="240" w:lineRule="auto"/>
       </w:pPr>
@@ -780,7 +1621,7 @@
     </w:p>
   </w:footnote>
   <w:footnote w:type="continuationSeparator" w:id="0">
-    <w:p>
+    <w:p xmlns:wp14="http://schemas.microsoft.com/office/word/2010/wordml" wp14:textId="77777777">
       <w:pPr>
         <w:spacing w:after="0" w:line="240" w:lineRule="auto"/>
       </w:pPr>
@@ -794,7 +1635,7 @@
 
 <file path=word/header1.xml><?xml version="1.0" encoding="utf-8"?>
 <w:hdr xmlns:wpc="http://schemas.microsoft.com/office/word/2010/wordprocessingCanvas" xmlns:cx="http://schemas.microsoft.com/office/drawing/2014/chartex" xmlns:cx1="http://schemas.microsoft.com/office/drawing/2015/9/8/chartex" xmlns:mc="http://schemas.openxmlformats.org/markup-compatibility/2006" xmlns:o="urn:schemas-microsoft-com:office:office" xmlns:r="http://schemas.openxmlformats.org/officeDocument/2006/relationships" xmlns:m="http://schemas.openxmlformats.org/officeDocument/2006/math" xmlns:v="urn:schemas-microsoft-com:vml" xmlns:wp14="http://schemas.microsoft.com/office/word/2010/wordprocessingDrawing" xmlns:wp="http://schemas.openxmlformats.org/drawingml/2006/wordprocessingDrawing" xmlns:w10="urn:schemas-microsoft-com:office:word" xmlns:w="http://schemas.openxmlformats.org/wordprocessingml/2006/main" xmlns:w14="http://schemas.microsoft.com/office/word/2010/wordml" xmlns:w15="http://schemas.microsoft.com/office/word/2012/wordml" xmlns:w16se="http://schemas.microsoft.com/office/word/2015/wordml/symex" xmlns:wpg="http://schemas.microsoft.com/office/word/2010/wordprocessingGroup" xmlns:wpi="http://schemas.microsoft.com/office/word/2010/wordprocessingInk" xmlns:wne="http://schemas.microsoft.com/office/word/2006/wordml" xmlns:wps="http://schemas.microsoft.com/office/word/2010/wordprocessingShape" mc:Ignorable="w14 w15 w16se wp14">
-  <w:p>
+  <w:p xmlns:wp14="http://schemas.microsoft.com/office/word/2010/wordml" wp14:textId="77777777">
     <w:pPr>
       <w:pStyle w:val="Cabealho"/>
     </w:pPr>
@@ -804,7 +1645,7 @@
 
 <file path=word/header2.xml><?xml version="1.0" encoding="utf-8"?>
 <w:hdr xmlns:wpc="http://schemas.microsoft.com/office/word/2010/wordprocessingCanvas" xmlns:cx="http://schemas.microsoft.com/office/drawing/2014/chartex" xmlns:cx1="http://schemas.microsoft.com/office/drawing/2015/9/8/chartex" xmlns:mc="http://schemas.openxmlformats.org/markup-compatibility/2006" xmlns:o="urn:schemas-microsoft-com:office:office" xmlns:r="http://schemas.openxmlformats.org/officeDocument/2006/relationships" xmlns:m="http://schemas.openxmlformats.org/officeDocument/2006/math" xmlns:v="urn:schemas-microsoft-com:vml" xmlns:wp14="http://schemas.microsoft.com/office/word/2010/wordprocessingDrawing" xmlns:wp="http://schemas.openxmlformats.org/drawingml/2006/wordprocessingDrawing" xmlns:w10="urn:schemas-microsoft-com:office:word" xmlns:w="http://schemas.openxmlformats.org/wordprocessingml/2006/main" xmlns:w14="http://schemas.microsoft.com/office/word/2010/wordml" xmlns:w15="http://schemas.microsoft.com/office/word/2012/wordml" xmlns:w16se="http://schemas.microsoft.com/office/word/2015/wordml/symex" xmlns:wpg="http://schemas.microsoft.com/office/word/2010/wordprocessingGroup" xmlns:wpi="http://schemas.microsoft.com/office/word/2010/wordprocessingInk" xmlns:wne="http://schemas.microsoft.com/office/word/2006/wordml" xmlns:wps="http://schemas.microsoft.com/office/word/2010/wordprocessingShape" mc:Ignorable="w14 w15 w16se wp14">
-  <w:p>
+  <w:p xmlns:wp14="http://schemas.microsoft.com/office/word/2010/wordml" wp14:textId="77777777">
     <w:pPr>
       <w:pStyle w:val="Cabealho"/>
       <w:jc w:val="center"/>
@@ -820,7 +1661,7 @@
 
 <file path=word/header3.xml><?xml version="1.0" encoding="utf-8"?>
 <w:hdr xmlns:wpc="http://schemas.microsoft.com/office/word/2010/wordprocessingCanvas" xmlns:cx="http://schemas.microsoft.com/office/drawing/2014/chartex" xmlns:cx1="http://schemas.microsoft.com/office/drawing/2015/9/8/chartex" xmlns:mc="http://schemas.openxmlformats.org/markup-compatibility/2006" xmlns:o="urn:schemas-microsoft-com:office:office" xmlns:r="http://schemas.openxmlformats.org/officeDocument/2006/relationships" xmlns:m="http://schemas.openxmlformats.org/officeDocument/2006/math" xmlns:v="urn:schemas-microsoft-com:vml" xmlns:wp14="http://schemas.microsoft.com/office/word/2010/wordprocessingDrawing" xmlns:wp="http://schemas.openxmlformats.org/drawingml/2006/wordprocessingDrawing" xmlns:w10="urn:schemas-microsoft-com:office:word" xmlns:w="http://schemas.openxmlformats.org/wordprocessingml/2006/main" xmlns:w14="http://schemas.microsoft.com/office/word/2010/wordml" xmlns:w15="http://schemas.microsoft.com/office/word/2012/wordml" xmlns:w16se="http://schemas.microsoft.com/office/word/2015/wordml/symex" xmlns:wpg="http://schemas.microsoft.com/office/word/2010/wordprocessingGroup" xmlns:wpi="http://schemas.microsoft.com/office/word/2010/wordprocessingInk" xmlns:wne="http://schemas.microsoft.com/office/word/2006/wordml" xmlns:wps="http://schemas.microsoft.com/office/word/2010/wordprocessingShape" mc:Ignorable="w14 w15 w16se wp14">
-  <w:p>
+  <w:p xmlns:wp14="http://schemas.microsoft.com/office/word/2010/wordml" wp14:textId="77777777">
     <w:pPr>
       <w:pStyle w:val="Cabealho"/>
     </w:pPr>
@@ -829,11 +1670,11 @@
 </file>
 
 <file path=word/styles.xml><?xml version="1.0" encoding="utf-8"?>
-<w:styles xmlns:mc="http://schemas.openxmlformats.org/markup-compatibility/2006" xmlns:r="http://schemas.openxmlformats.org/officeDocument/2006/relationships" xmlns:w="http://schemas.openxmlformats.org/wordprocessingml/2006/main" xmlns:w14="http://schemas.microsoft.com/office/word/2010/wordml" xmlns:w15="http://schemas.microsoft.com/office/word/2012/wordml" xmlns:w16se="http://schemas.microsoft.com/office/word/2015/wordml/symex" mc:Ignorable="w14 w15 w16se">
+<w:styles xmlns:wp14="http://schemas.microsoft.com/office/word/2010/wordprocessingDrawing" xmlns:mc="http://schemas.openxmlformats.org/markup-compatibility/2006" xmlns:r="http://schemas.openxmlformats.org/officeDocument/2006/relationships" xmlns:w="http://schemas.openxmlformats.org/wordprocessingml/2006/main" xmlns:w14="http://schemas.microsoft.com/office/word/2010/wordml" xmlns:w15="http://schemas.microsoft.com/office/word/2012/wordml" xmlns:w16se="http://schemas.microsoft.com/office/word/2015/wordml/symex" mc:Ignorable="w14 w15 w16se wp14">
   <w:docDefaults>
     <w:rPrDefault>
       <w:rPr>
-        <w:rFonts w:asciiTheme="minorHAnsi" w:eastAsiaTheme="minorHAnsi" w:hAnsiTheme="minorHAnsi" w:cstheme="minorBidi"/>
+        <w:rFonts w:asciiTheme="minorHAnsi" w:hAnsiTheme="minorHAnsi" w:eastAsiaTheme="minorHAnsi" w:cstheme="minorBidi"/>
         <w:sz w:val="22"/>
         <w:szCs w:val="22"/>
         <w:lang w:val="pt-BR" w:eastAsia="en-US" w:bidi="ar-SA"/>
@@ -848,14 +1689,14 @@
   <w:latentStyles w:defLockedState="0" w:defUIPriority="99" w:defSemiHidden="0" w:defUnhideWhenUsed="0" w:defQFormat="0" w:count="371">
     <w:lsdException w:name="Normal" w:uiPriority="0" w:qFormat="1"/>
     <w:lsdException w:name="heading 1" w:uiPriority="9" w:qFormat="1"/>
-    <w:lsdException w:name="heading 2" w:semiHidden="1" w:uiPriority="9" w:unhideWhenUsed="1" w:qFormat="1"/>
-    <w:lsdException w:name="heading 3" w:semiHidden="1" w:uiPriority="9" w:unhideWhenUsed="1" w:qFormat="1"/>
-    <w:lsdException w:name="heading 4" w:semiHidden="1" w:uiPriority="9" w:unhideWhenUsed="1" w:qFormat="1"/>
-    <w:lsdException w:name="heading 5" w:semiHidden="1" w:uiPriority="9" w:unhideWhenUsed="1" w:qFormat="1"/>
-    <w:lsdException w:name="heading 6" w:semiHidden="1" w:uiPriority="9" w:unhideWhenUsed="1" w:qFormat="1"/>
-    <w:lsdException w:name="heading 7" w:semiHidden="1" w:uiPriority="9" w:unhideWhenUsed="1" w:qFormat="1"/>
-    <w:lsdException w:name="heading 8" w:semiHidden="1" w:uiPriority="9" w:unhideWhenUsed="1" w:qFormat="1"/>
-    <w:lsdException w:name="heading 9" w:semiHidden="1" w:uiPriority="9" w:unhideWhenUsed="1" w:qFormat="1"/>
+    <w:lsdException w:name="heading 2" w:uiPriority="9" w:semiHidden="1" w:unhideWhenUsed="1" w:qFormat="1"/>
+    <w:lsdException w:name="heading 3" w:uiPriority="9" w:semiHidden="1" w:unhideWhenUsed="1" w:qFormat="1"/>
+    <w:lsdException w:name="heading 4" w:uiPriority="9" w:semiHidden="1" w:unhideWhenUsed="1" w:qFormat="1"/>
+    <w:lsdException w:name="heading 5" w:uiPriority="9" w:semiHidden="1" w:unhideWhenUsed="1" w:qFormat="1"/>
+    <w:lsdException w:name="heading 6" w:uiPriority="9" w:semiHidden="1" w:unhideWhenUsed="1" w:qFormat="1"/>
+    <w:lsdException w:name="heading 7" w:uiPriority="9" w:semiHidden="1" w:unhideWhenUsed="1" w:qFormat="1"/>
+    <w:lsdException w:name="heading 8" w:uiPriority="9" w:semiHidden="1" w:unhideWhenUsed="1" w:qFormat="1"/>
+    <w:lsdException w:name="heading 9" w:uiPriority="9" w:semiHidden="1" w:unhideWhenUsed="1" w:qFormat="1"/>
     <w:lsdException w:name="index 1" w:semiHidden="1" w:unhideWhenUsed="1"/>
     <w:lsdException w:name="index 2" w:semiHidden="1" w:unhideWhenUsed="1"/>
     <w:lsdException w:name="index 3" w:semiHidden="1" w:unhideWhenUsed="1"/>
@@ -865,22 +1706,22 @@
     <w:lsdException w:name="index 7" w:semiHidden="1" w:unhideWhenUsed="1"/>
     <w:lsdException w:name="index 8" w:semiHidden="1" w:unhideWhenUsed="1"/>
     <w:lsdException w:name="index 9" w:semiHidden="1" w:unhideWhenUsed="1"/>
-    <w:lsdException w:name="toc 1" w:semiHidden="1" w:uiPriority="39" w:unhideWhenUsed="1"/>
-    <w:lsdException w:name="toc 2" w:semiHidden="1" w:uiPriority="39" w:unhideWhenUsed="1"/>
-    <w:lsdException w:name="toc 3" w:semiHidden="1" w:uiPriority="39" w:unhideWhenUsed="1"/>
-    <w:lsdException w:name="toc 4" w:semiHidden="1" w:uiPriority="39" w:unhideWhenUsed="1"/>
-    <w:lsdException w:name="toc 5" w:semiHidden="1" w:uiPriority="39" w:unhideWhenUsed="1"/>
-    <w:lsdException w:name="toc 6" w:semiHidden="1" w:uiPriority="39" w:unhideWhenUsed="1"/>
-    <w:lsdException w:name="toc 7" w:semiHidden="1" w:uiPriority="39" w:unhideWhenUsed="1"/>
-    <w:lsdException w:name="toc 8" w:semiHidden="1" w:uiPriority="39" w:unhideWhenUsed="1"/>
-    <w:lsdException w:name="toc 9" w:semiHidden="1" w:uiPriority="39" w:unhideWhenUsed="1"/>
+    <w:lsdException w:name="toc 1" w:uiPriority="39" w:semiHidden="1" w:unhideWhenUsed="1"/>
+    <w:lsdException w:name="toc 2" w:uiPriority="39" w:semiHidden="1" w:unhideWhenUsed="1"/>
+    <w:lsdException w:name="toc 3" w:uiPriority="39" w:semiHidden="1" w:unhideWhenUsed="1"/>
+    <w:lsdException w:name="toc 4" w:uiPriority="39" w:semiHidden="1" w:unhideWhenUsed="1"/>
+    <w:lsdException w:name="toc 5" w:uiPriority="39" w:semiHidden="1" w:unhideWhenUsed="1"/>
+    <w:lsdException w:name="toc 6" w:uiPriority="39" w:semiHidden="1" w:unhideWhenUsed="1"/>
+    <w:lsdException w:name="toc 7" w:uiPriority="39" w:semiHidden="1" w:unhideWhenUsed="1"/>
+    <w:lsdException w:name="toc 8" w:uiPriority="39" w:semiHidden="1" w:unhideWhenUsed="1"/>
+    <w:lsdException w:name="toc 9" w:uiPriority="39" w:semiHidden="1" w:unhideWhenUsed="1"/>
     <w:lsdException w:name="Normal Indent" w:semiHidden="1" w:unhideWhenUsed="1"/>
     <w:lsdException w:name="footnote text" w:semiHidden="1" w:unhideWhenUsed="1"/>
     <w:lsdException w:name="annotation text" w:semiHidden="1" w:unhideWhenUsed="1"/>
     <w:lsdException w:name="header" w:semiHidden="1" w:unhideWhenUsed="1"/>
     <w:lsdException w:name="footer" w:semiHidden="1" w:unhideWhenUsed="1"/>
     <w:lsdException w:name="index heading" w:semiHidden="1" w:unhideWhenUsed="1"/>
-    <w:lsdException w:name="caption" w:semiHidden="1" w:uiPriority="35" w:unhideWhenUsed="1" w:qFormat="1"/>
+    <w:lsdException w:name="caption" w:uiPriority="35" w:semiHidden="1" w:unhideWhenUsed="1" w:qFormat="1"/>
     <w:lsdException w:name="table of figures" w:semiHidden="1" w:unhideWhenUsed="1"/>
     <w:lsdException w:name="envelope address" w:semiHidden="1" w:unhideWhenUsed="1"/>
     <w:lsdException w:name="envelope return" w:semiHidden="1" w:unhideWhenUsed="1"/>
@@ -911,7 +1752,7 @@
     <w:lsdException w:name="Title" w:uiPriority="10" w:qFormat="1"/>
     <w:lsdException w:name="Closing" w:semiHidden="1" w:unhideWhenUsed="1"/>
     <w:lsdException w:name="Signature" w:semiHidden="1" w:unhideWhenUsed="1"/>
-    <w:lsdException w:name="Default Paragraph Font" w:semiHidden="1" w:uiPriority="1" w:unhideWhenUsed="1"/>
+    <w:lsdException w:name="Default Paragraph Font" w:uiPriority="1" w:semiHidden="1" w:unhideWhenUsed="1"/>
     <w:lsdException w:name="Body Text" w:semiHidden="1" w:unhideWhenUsed="1"/>
     <w:lsdException w:name="Body Text Indent" w:semiHidden="1" w:unhideWhenUsed="1"/>
     <w:lsdException w:name="List Continue" w:semiHidden="1" w:unhideWhenUsed="1"/>
@@ -1111,8 +1952,8 @@
     <w:lsdException w:name="Subtle Reference" w:uiPriority="31" w:qFormat="1"/>
     <w:lsdException w:name="Intense Reference" w:uiPriority="32" w:qFormat="1"/>
     <w:lsdException w:name="Book Title" w:uiPriority="33" w:qFormat="1"/>
-    <w:lsdException w:name="Bibliography" w:semiHidden="1" w:uiPriority="37" w:unhideWhenUsed="1"/>
-    <w:lsdException w:name="TOC Heading" w:semiHidden="1" w:uiPriority="39" w:unhideWhenUsed="1" w:qFormat="1"/>
+    <w:lsdException w:name="Bibliography" w:uiPriority="37" w:semiHidden="1" w:unhideWhenUsed="1"/>
+    <w:lsdException w:name="TOC Heading" w:uiPriority="39" w:semiHidden="1" w:unhideWhenUsed="1" w:qFormat="1"/>
     <w:lsdException w:name="Plain Table 1" w:uiPriority="41"/>
     <w:lsdException w:name="Plain Table 2" w:uiPriority="42"/>
     <w:lsdException w:name="Plain Table 3" w:uiPriority="43"/>
@@ -1218,7 +2059,7 @@
     <w:lsdException w:name="List Table 6 Colorful Accent 6" w:uiPriority="51"/>
     <w:lsdException w:name="List Table 7 Colorful Accent 6" w:uiPriority="52"/>
   </w:latentStyles>
-  <w:style w:type="paragraph" w:default="1" w:styleId="Normal">
+  <w:style w:type="paragraph" w:styleId="Normal" w:default="1">
     <w:name w:val="Normal"/>
     <w:qFormat/>
     <w:rsid w:val="004B70AF"/>
@@ -1226,7 +2067,7 @@
       <w:spacing w:after="200" w:line="276" w:lineRule="auto"/>
     </w:pPr>
     <w:rPr>
-      <w:rFonts w:ascii="Calibri" w:eastAsia="Calibri" w:hAnsi="Calibri" w:cs="Calibri"/>
+      <w:rFonts w:ascii="Calibri" w:hAnsi="Calibri" w:eastAsia="Calibri" w:cs="Calibri"/>
     </w:rPr>
   </w:style>
   <w:style w:type="paragraph" w:styleId="Ttulo1">
@@ -1244,7 +2085,7 @@
       <w:outlineLvl w:val="0"/>
     </w:pPr>
     <w:rPr>
-      <w:rFonts w:asciiTheme="majorHAnsi" w:eastAsiaTheme="majorEastAsia" w:hAnsiTheme="majorHAnsi" w:cstheme="majorBidi"/>
+      <w:rFonts w:asciiTheme="majorHAnsi" w:hAnsiTheme="majorHAnsi" w:eastAsiaTheme="majorEastAsia" w:cstheme="majorBidi"/>
       <w:b/>
       <w:bCs/>
       <w:color w:val="2E74B5" w:themeColor="accent1" w:themeShade="BF"/>
@@ -1252,13 +2093,13 @@
       <w:szCs w:val="28"/>
     </w:rPr>
   </w:style>
-  <w:style w:type="character" w:default="1" w:styleId="Fontepargpadro">
+  <w:style w:type="character" w:styleId="Fontepargpadro" w:default="1">
     <w:name w:val="Default Paragraph Font"/>
     <w:uiPriority w:val="1"/>
     <w:semiHidden/>
     <w:unhideWhenUsed/>
   </w:style>
-  <w:style w:type="table" w:default="1" w:styleId="Tabelanormal">
+  <w:style w:type="table" w:styleId="Tabelanormal" w:default="1">
     <w:name w:val="Normal Table"/>
     <w:uiPriority w:val="99"/>
     <w:semiHidden/>
@@ -1273,20 +2114,20 @@
       </w:tblCellMar>
     </w:tblPr>
   </w:style>
-  <w:style w:type="numbering" w:default="1" w:styleId="Semlista">
+  <w:style w:type="numbering" w:styleId="Semlista" w:default="1">
     <w:name w:val="No List"/>
     <w:uiPriority w:val="99"/>
     <w:semiHidden/>
     <w:unhideWhenUsed/>
   </w:style>
-  <w:style w:type="character" w:customStyle="1" w:styleId="Ttulo1Char">
+  <w:style w:type="character" w:styleId="Ttulo1Char" w:customStyle="1">
     <w:name w:val="Título 1 Char"/>
     <w:basedOn w:val="Fontepargpadro"/>
     <w:link w:val="Ttulo1"/>
     <w:uiPriority w:val="9"/>
     <w:rsid w:val="004B70AF"/>
     <w:rPr>
-      <w:rFonts w:asciiTheme="majorHAnsi" w:eastAsiaTheme="majorEastAsia" w:hAnsiTheme="majorHAnsi" w:cstheme="majorBidi"/>
+      <w:rFonts w:asciiTheme="majorHAnsi" w:hAnsiTheme="majorHAnsi" w:eastAsiaTheme="majorEastAsia" w:cstheme="majorBidi"/>
       <w:b/>
       <w:bCs/>
       <w:color w:val="2E74B5" w:themeColor="accent1" w:themeShade="BF"/>
@@ -1309,14 +2150,14 @@
       <w:spacing w:after="0" w:line="240" w:lineRule="auto"/>
     </w:pPr>
   </w:style>
-  <w:style w:type="character" w:customStyle="1" w:styleId="CabealhoChar">
+  <w:style w:type="character" w:styleId="CabealhoChar" w:customStyle="1">
     <w:name w:val="Cabeçalho Char"/>
     <w:basedOn w:val="Fontepargpadro"/>
     <w:link w:val="Cabealho"/>
     <w:uiPriority w:val="99"/>
     <w:rsid w:val="008B21D8"/>
     <w:rPr>
-      <w:rFonts w:ascii="Calibri" w:eastAsia="Calibri" w:hAnsi="Calibri" w:cs="Calibri"/>
+      <w:rFonts w:ascii="Calibri" w:hAnsi="Calibri" w:eastAsia="Calibri" w:cs="Calibri"/>
     </w:rPr>
   </w:style>
   <w:style w:type="paragraph" w:styleId="Rodap">
@@ -1334,21 +2175,21 @@
       <w:spacing w:after="0" w:line="240" w:lineRule="auto"/>
     </w:pPr>
   </w:style>
-  <w:style w:type="character" w:customStyle="1" w:styleId="RodapChar">
+  <w:style w:type="character" w:styleId="RodapChar" w:customStyle="1">
     <w:name w:val="Rodapé Char"/>
     <w:basedOn w:val="Fontepargpadro"/>
     <w:link w:val="Rodap"/>
     <w:uiPriority w:val="99"/>
     <w:rsid w:val="008B21D8"/>
     <w:rPr>
-      <w:rFonts w:ascii="Calibri" w:eastAsia="Calibri" w:hAnsi="Calibri" w:cs="Calibri"/>
+      <w:rFonts w:ascii="Calibri" w:hAnsi="Calibri" w:eastAsia="Calibri" w:cs="Calibri"/>
     </w:rPr>
   </w:style>
 </w:styles>
 </file>
 
 <file path=word/theme/theme1.xml><?xml version="1.0" encoding="utf-8"?>
-<a:theme xmlns:a="http://schemas.openxmlformats.org/drawingml/2006/main" name="Tema do Office">
+<a:theme xmlns:a="http://schemas.openxmlformats.org/drawingml/2006/main" xmlns:thm15="http://schemas.microsoft.com/office/thememl/2012/main" name="Tema do Office">
   <a:themeElements>
     <a:clrScheme name="Escritório">
       <a:dk1>

</xml_diff>